<commit_message>
UI Api Automation final Assessment
</commit_message>
<xml_diff>
--- a/ApiAutomationFinalAssessment/API_Automation_Report.docx
+++ b/ApiAutomationFinalAssessment/API_Automation_Report.docx
@@ -59,6 +59,7 @@
           <w:szCs w:val="28"/>
         </w:rPr>
       </w:pPr>
+      <w:proofErr w:type="gramStart"/>
       <w:r>
         <w:rPr>
           <w:b/>
@@ -66,26 +67,46 @@
           <w:sz w:val="28"/>
           <w:szCs w:val="28"/>
         </w:rPr>
-        <w:t>Name : Shahbaz Ahmad</w:t>
+        <w:t>Name :</w:t>
       </w:r>
-    </w:p>
-    <w:p>
-      <w:pPr>
+      <w:proofErr w:type="gramEnd"/>
+      <w:r>
         <w:rPr>
           <w:b/>
           <w:bCs/>
           <w:sz w:val="28"/>
           <w:szCs w:val="28"/>
         </w:rPr>
-      </w:pPr>
-      <w:r>
+        <w:t xml:space="preserve"> Shahbaz Ahmad</w:t>
+      </w:r>
+    </w:p>
+    <w:p>
+      <w:pPr>
         <w:rPr>
           <w:b/>
           <w:bCs/>
           <w:sz w:val="28"/>
           <w:szCs w:val="28"/>
         </w:rPr>
-        <w:t>GitHub branch:</w:t>
+      </w:pPr>
+      <w:r>
+        <w:rPr>
+          <w:b/>
+          <w:bCs/>
+          <w:sz w:val="28"/>
+          <w:szCs w:val="28"/>
+        </w:rPr>
+        <w:t>GitHub branch</w:t>
+      </w:r>
+      <w:proofErr w:type="gramStart"/>
+      <w:r>
+        <w:rPr>
+          <w:b/>
+          <w:bCs/>
+          <w:sz w:val="28"/>
+          <w:szCs w:val="28"/>
+        </w:rPr>
+        <w:t>:</w:t>
       </w:r>
       <w:r>
         <w:t xml:space="preserve"> </w:t>
@@ -100,27 +121,28 @@
           <w:sz w:val="28"/>
           <w:szCs w:val="28"/>
         </w:rPr>
-        <w:t>capstone/307424-shahbaz-ahmad</w:t>
+        <w:t>capstone</w:t>
       </w:r>
-    </w:p>
-    <w:p>
-      <w:pPr>
+      <w:proofErr w:type="gramEnd"/>
+      <w:r>
         <w:rPr>
           <w:b/>
           <w:bCs/>
           <w:sz w:val="28"/>
           <w:szCs w:val="28"/>
         </w:rPr>
-      </w:pPr>
-      <w:r>
+        <w:t>/307424-shahbaz-ahmad</w:t>
+      </w:r>
+    </w:p>
+    <w:p>
+      <w:pPr>
         <w:rPr>
           <w:b/>
           <w:bCs/>
           <w:sz w:val="28"/>
           <w:szCs w:val="28"/>
         </w:rPr>
-        <w:t>Date: 2</w:t>
-      </w:r>
+      </w:pPr>
       <w:r>
         <w:rPr>
           <w:b/>
@@ -128,7 +150,7 @@
           <w:sz w:val="28"/>
           <w:szCs w:val="28"/>
         </w:rPr>
-        <w:t>1</w:t>
+        <w:t>Date: 2</w:t>
       </w:r>
       <w:r>
         <w:rPr>
@@ -137,7 +159,7 @@
           <w:sz w:val="28"/>
           <w:szCs w:val="28"/>
         </w:rPr>
-        <w:t>-0</w:t>
+        <w:t>1</w:t>
       </w:r>
       <w:r>
         <w:rPr>
@@ -146,7 +168,7 @@
           <w:sz w:val="28"/>
           <w:szCs w:val="28"/>
         </w:rPr>
-        <w:t>7</w:t>
+        <w:t>-0</w:t>
       </w:r>
       <w:r>
         <w:rPr>
@@ -155,6 +177,15 @@
           <w:sz w:val="28"/>
           <w:szCs w:val="28"/>
         </w:rPr>
+        <w:t>7</w:t>
+      </w:r>
+      <w:r>
+        <w:rPr>
+          <w:b/>
+          <w:bCs/>
+          <w:sz w:val="28"/>
+          <w:szCs w:val="28"/>
+        </w:rPr>
         <w:t>-2026</w:t>
       </w:r>
     </w:p>
@@ -175,8 +206,9 @@
           <w:szCs w:val="36"/>
           <w:u w:val="single"/>
         </w:rPr>
-        <w:t xml:space="preserve">Question  </w:t>
+        <w:t xml:space="preserve">Section </w:t>
       </w:r>
+      <w:proofErr w:type="gramStart"/>
       <w:r>
         <w:rPr>
           <w:color w:val="auto"/>
@@ -184,26 +216,36 @@
           <w:szCs w:val="36"/>
           <w:u w:val="single"/>
         </w:rPr>
-        <w:t>1</w:t>
+        <w:t>C :</w:t>
       </w:r>
-    </w:p>
-    <w:p>
-      <w:pPr>
-        <w:pStyle w:val="Heading1"/>
+      <w:proofErr w:type="gramEnd"/>
+      <w:r>
         <w:rPr>
           <w:color w:val="auto"/>
           <w:sz w:val="36"/>
           <w:szCs w:val="36"/>
           <w:u w:val="single"/>
         </w:rPr>
-      </w:pPr>
-      <w:r>
+        <w:t xml:space="preserve"> - Api Automation</w:t>
+      </w:r>
+    </w:p>
+    <w:p>
+      <w:pPr>
+        <w:pStyle w:val="Heading1"/>
         <w:rPr>
           <w:color w:val="auto"/>
           <w:sz w:val="36"/>
           <w:szCs w:val="36"/>
           <w:u w:val="single"/>
         </w:rPr>
+      </w:pPr>
+      <w:r>
+        <w:rPr>
+          <w:color w:val="auto"/>
+          <w:sz w:val="36"/>
+          <w:szCs w:val="36"/>
+          <w:u w:val="single"/>
+        </w:rPr>
         <w:t>Objective</w:t>
       </w:r>
     </w:p>
@@ -233,7 +275,14 @@
           <w:sz w:val="28"/>
           <w:szCs w:val="28"/>
         </w:rPr>
-        <w:t>https://chess-agent-83252463.figma.site/</w:t>
+        <w:t>https://demoqa.com</w:t>
+      </w:r>
+      <w:r>
+        <w:rPr>
+          <w:sz w:val="28"/>
+          <w:szCs w:val="28"/>
+        </w:rPr>
+        <w:t>/</w:t>
       </w:r>
     </w:p>
     <w:p>
@@ -244,6 +293,7 @@
         </w:rPr>
       </w:pPr>
       <w:proofErr w:type="spellStart"/>
+      <w:proofErr w:type="gramStart"/>
       <w:r>
         <w:rPr>
           <w:sz w:val="28"/>
@@ -259,6 +309,7 @@
         </w:rPr>
         <w:t>:-</w:t>
       </w:r>
+      <w:proofErr w:type="gramEnd"/>
       <w:r>
         <w:rPr>
           <w:sz w:val="28"/>
@@ -283,7 +334,23 @@
             <w:sz w:val="28"/>
             <w:szCs w:val="28"/>
           </w:rPr>
-          <w:t>/SDET-2 at capstone/307424-shahbaz-ahmad</w:t>
+          <w:t>/SDET-2 at capsto</w:t>
+        </w:r>
+        <w:r>
+          <w:rPr>
+            <w:rStyle w:val="Hyperlink"/>
+            <w:sz w:val="28"/>
+            <w:szCs w:val="28"/>
+          </w:rPr>
+          <w:t>n</w:t>
+        </w:r>
+        <w:r>
+          <w:rPr>
+            <w:rStyle w:val="Hyperlink"/>
+            <w:sz w:val="28"/>
+            <w:szCs w:val="28"/>
+          </w:rPr>
+          <w:t>e/307424-shahbaz-ahmad</w:t>
         </w:r>
       </w:hyperlink>
     </w:p>
@@ -423,6 +490,21 @@
         <w:t>SpecFactory</w:t>
       </w:r>
       <w:proofErr w:type="spellEnd"/>
+    </w:p>
+    <w:p>
+      <w:pPr>
+        <w:rPr>
+          <w:sz w:val="28"/>
+          <w:szCs w:val="28"/>
+        </w:rPr>
+      </w:pPr>
+      <w:r>
+        <w:rPr>
+          <w:sz w:val="28"/>
+          <w:szCs w:val="28"/>
+        </w:rPr>
+        <w:t>3.ClientPage</w:t>
+      </w:r>
       <w:r>
         <w:rPr>
           <w:sz w:val="28"/>
@@ -435,7 +517,7 @@
           <w:sz w:val="28"/>
           <w:szCs w:val="28"/>
         </w:rPr>
-        <w:t>3</w:t>
+        <w:t>4</w:t>
       </w:r>
       <w:r>
         <w:rPr>
@@ -470,7 +552,7 @@
           <w:sz w:val="28"/>
           <w:szCs w:val="28"/>
         </w:rPr>
-        <w:t>4</w:t>
+        <w:t>5</w:t>
       </w:r>
       <w:r>
         <w:rPr>
@@ -479,28 +561,25 @@
         </w:rPr>
         <w:t>. Validate response</w:t>
       </w:r>
-    </w:p>
-    <w:p>
-      <w:pPr>
+      <w:r>
         <w:rPr>
           <w:sz w:val="28"/>
           <w:szCs w:val="28"/>
         </w:rPr>
-      </w:pPr>
-    </w:p>
-    <w:p>
-      <w:pPr>
+        <w:br/>
+      </w:r>
+      <w:r>
         <w:rPr>
           <w:sz w:val="28"/>
           <w:szCs w:val="28"/>
         </w:rPr>
-      </w:pPr>
+        <w:t>6</w:t>
+      </w:r>
       <w:r>
         <w:rPr>
           <w:sz w:val="28"/>
           <w:szCs w:val="28"/>
         </w:rPr>
-        <w:br/>
         <w:t>. Generate report</w:t>
       </w:r>
     </w:p>
@@ -544,6 +623,106 @@
           <w:u w:val="single"/>
         </w:rPr>
       </w:pPr>
+      <w:r>
+        <w:rPr>
+          <w:b/>
+          <w:bCs/>
+          <w:sz w:val="36"/>
+          <w:szCs w:val="36"/>
+          <w:u w:val="single"/>
+        </w:rPr>
+        <w:drawing>
+          <wp:inline distT="0" distB="0" distL="0" distR="0" wp14:anchorId="62332B5B" wp14:editId="7EF197FC">
+            <wp:extent cx="5486400" cy="4893945"/>
+            <wp:effectExtent l="0" t="0" r="0" b="1905"/>
+            <wp:docPr id="1797234729" name="Picture 1"/>
+            <wp:cNvGraphicFramePr>
+              <a:graphicFrameLocks xmlns:a="http://schemas.openxmlformats.org/drawingml/2006/main" noChangeAspect="1"/>
+            </wp:cNvGraphicFramePr>
+            <a:graphic xmlns:a="http://schemas.openxmlformats.org/drawingml/2006/main">
+              <a:graphicData uri="http://schemas.openxmlformats.org/drawingml/2006/picture">
+                <pic:pic xmlns:pic="http://schemas.openxmlformats.org/drawingml/2006/picture">
+                  <pic:nvPicPr>
+                    <pic:cNvPr id="1797234729" name=""/>
+                    <pic:cNvPicPr/>
+                  </pic:nvPicPr>
+                  <pic:blipFill>
+                    <a:blip r:embed="rId9"/>
+                    <a:stretch>
+                      <a:fillRect/>
+                    </a:stretch>
+                  </pic:blipFill>
+                  <pic:spPr>
+                    <a:xfrm>
+                      <a:off x="0" y="0"/>
+                      <a:ext cx="5486400" cy="4893945"/>
+                    </a:xfrm>
+                    <a:prstGeom prst="rect">
+                      <a:avLst/>
+                    </a:prstGeom>
+                  </pic:spPr>
+                </pic:pic>
+              </a:graphicData>
+            </a:graphic>
+          </wp:inline>
+        </w:drawing>
+      </w:r>
+    </w:p>
+    <w:p>
+      <w:pPr>
+        <w:rPr>
+          <w:b/>
+          <w:bCs/>
+          <w:sz w:val="36"/>
+          <w:szCs w:val="36"/>
+          <w:u w:val="single"/>
+        </w:rPr>
+      </w:pPr>
+      <w:r>
+        <w:rPr>
+          <w:b/>
+          <w:bCs/>
+          <w:sz w:val="36"/>
+          <w:szCs w:val="36"/>
+          <w:u w:val="single"/>
+        </w:rPr>
+        <w:lastRenderedPageBreak/>
+        <w:drawing>
+          <wp:inline distT="0" distB="0" distL="0" distR="0" wp14:anchorId="5185B249" wp14:editId="0A2D55DB">
+            <wp:extent cx="5486400" cy="5271135"/>
+            <wp:effectExtent l="0" t="0" r="0" b="5715"/>
+            <wp:docPr id="1968048282" name="Picture 1"/>
+            <wp:cNvGraphicFramePr>
+              <a:graphicFrameLocks xmlns:a="http://schemas.openxmlformats.org/drawingml/2006/main" noChangeAspect="1"/>
+            </wp:cNvGraphicFramePr>
+            <a:graphic xmlns:a="http://schemas.openxmlformats.org/drawingml/2006/main">
+              <a:graphicData uri="http://schemas.openxmlformats.org/drawingml/2006/picture">
+                <pic:pic xmlns:pic="http://schemas.openxmlformats.org/drawingml/2006/picture">
+                  <pic:nvPicPr>
+                    <pic:cNvPr id="1968048282" name=""/>
+                    <pic:cNvPicPr/>
+                  </pic:nvPicPr>
+                  <pic:blipFill>
+                    <a:blip r:embed="rId10"/>
+                    <a:stretch>
+                      <a:fillRect/>
+                    </a:stretch>
+                  </pic:blipFill>
+                  <pic:spPr>
+                    <a:xfrm>
+                      <a:off x="0" y="0"/>
+                      <a:ext cx="5486400" cy="5271135"/>
+                    </a:xfrm>
+                    <a:prstGeom prst="rect">
+                      <a:avLst/>
+                    </a:prstGeom>
+                  </pic:spPr>
+                </pic:pic>
+              </a:graphicData>
+            </a:graphic>
+          </wp:inline>
+        </w:drawing>
+      </w:r>
     </w:p>
     <w:p>
       <w:pPr>
@@ -577,7 +756,46 @@
           <w:sz w:val="28"/>
           <w:szCs w:val="28"/>
         </w:rPr>
-        <w:t xml:space="preserve">"As a QA Engineer, I want to create a new post and verify the response. </w:t>
+        <w:t xml:space="preserve">Create a </w:t>
+      </w:r>
+      <w:proofErr w:type="gramStart"/>
+      <w:r>
+        <w:rPr>
+          <w:sz w:val="28"/>
+          <w:szCs w:val="28"/>
+        </w:rPr>
+        <w:t>user ,</w:t>
+      </w:r>
+      <w:proofErr w:type="gramEnd"/>
+      <w:r>
+        <w:rPr>
+          <w:sz w:val="28"/>
+          <w:szCs w:val="28"/>
+        </w:rPr>
+        <w:t xml:space="preserve"> generate </w:t>
+      </w:r>
+      <w:proofErr w:type="gramStart"/>
+      <w:r>
+        <w:rPr>
+          <w:sz w:val="28"/>
+          <w:szCs w:val="28"/>
+        </w:rPr>
+        <w:t>a</w:t>
+      </w:r>
+      <w:proofErr w:type="gramEnd"/>
+      <w:r>
+        <w:rPr>
+          <w:sz w:val="28"/>
+          <w:szCs w:val="28"/>
+        </w:rPr>
+        <w:t xml:space="preserve"> authentication token, and retrieve this list of books using the token</w:t>
+      </w:r>
+      <w:r>
+        <w:rPr>
+          <w:sz w:val="28"/>
+          <w:szCs w:val="28"/>
+        </w:rPr>
+        <w:t xml:space="preserve"> </w:t>
       </w:r>
     </w:p>
     <w:p>
@@ -695,6 +913,7 @@
           <w:sz w:val="28"/>
           <w:szCs w:val="28"/>
         </w:rPr>
+        <w:lastRenderedPageBreak/>
         <w:t>allure serve target/allure-results</w:t>
       </w:r>
     </w:p>
@@ -753,6 +972,240 @@
           <w:sz w:val="36"/>
           <w:szCs w:val="36"/>
         </w:rPr>
+        <w:drawing>
+          <wp:inline distT="0" distB="0" distL="0" distR="0" wp14:anchorId="3FFF4575" wp14:editId="0ABB3B47">
+            <wp:extent cx="5486400" cy="3743325"/>
+            <wp:effectExtent l="0" t="0" r="0" b="9525"/>
+            <wp:docPr id="236335292" name="Picture 1"/>
+            <wp:cNvGraphicFramePr>
+              <a:graphicFrameLocks xmlns:a="http://schemas.openxmlformats.org/drawingml/2006/main" noChangeAspect="1"/>
+            </wp:cNvGraphicFramePr>
+            <a:graphic xmlns:a="http://schemas.openxmlformats.org/drawingml/2006/main">
+              <a:graphicData uri="http://schemas.openxmlformats.org/drawingml/2006/picture">
+                <pic:pic xmlns:pic="http://schemas.openxmlformats.org/drawingml/2006/picture">
+                  <pic:nvPicPr>
+                    <pic:cNvPr id="236335292" name=""/>
+                    <pic:cNvPicPr/>
+                  </pic:nvPicPr>
+                  <pic:blipFill>
+                    <a:blip r:embed="rId11"/>
+                    <a:stretch>
+                      <a:fillRect/>
+                    </a:stretch>
+                  </pic:blipFill>
+                  <pic:spPr>
+                    <a:xfrm>
+                      <a:off x="0" y="0"/>
+                      <a:ext cx="5486400" cy="3743325"/>
+                    </a:xfrm>
+                    <a:prstGeom prst="rect">
+                      <a:avLst/>
+                    </a:prstGeom>
+                  </pic:spPr>
+                </pic:pic>
+              </a:graphicData>
+            </a:graphic>
+          </wp:inline>
+        </w:drawing>
+      </w:r>
+    </w:p>
+    <w:p>
+      <w:pPr>
+        <w:rPr>
+          <w:b/>
+          <w:bCs/>
+          <w:sz w:val="36"/>
+          <w:szCs w:val="36"/>
+        </w:rPr>
+      </w:pPr>
+      <w:r>
+        <w:rPr>
+          <w:b/>
+          <w:bCs/>
+          <w:sz w:val="36"/>
+          <w:szCs w:val="36"/>
+        </w:rPr>
+        <w:drawing>
+          <wp:inline distT="0" distB="0" distL="0" distR="0" wp14:anchorId="6F0AF2E1" wp14:editId="55EAEC0F">
+            <wp:extent cx="5486400" cy="2774950"/>
+            <wp:effectExtent l="0" t="0" r="0" b="6350"/>
+            <wp:docPr id="1793419499" name="Picture 1"/>
+            <wp:cNvGraphicFramePr>
+              <a:graphicFrameLocks xmlns:a="http://schemas.openxmlformats.org/drawingml/2006/main" noChangeAspect="1"/>
+            </wp:cNvGraphicFramePr>
+            <a:graphic xmlns:a="http://schemas.openxmlformats.org/drawingml/2006/main">
+              <a:graphicData uri="http://schemas.openxmlformats.org/drawingml/2006/picture">
+                <pic:pic xmlns:pic="http://schemas.openxmlformats.org/drawingml/2006/picture">
+                  <pic:nvPicPr>
+                    <pic:cNvPr id="1793419499" name=""/>
+                    <pic:cNvPicPr/>
+                  </pic:nvPicPr>
+                  <pic:blipFill>
+                    <a:blip r:embed="rId12"/>
+                    <a:stretch>
+                      <a:fillRect/>
+                    </a:stretch>
+                  </pic:blipFill>
+                  <pic:spPr>
+                    <a:xfrm>
+                      <a:off x="0" y="0"/>
+                      <a:ext cx="5486400" cy="2774950"/>
+                    </a:xfrm>
+                    <a:prstGeom prst="rect">
+                      <a:avLst/>
+                    </a:prstGeom>
+                  </pic:spPr>
+                </pic:pic>
+              </a:graphicData>
+            </a:graphic>
+          </wp:inline>
+        </w:drawing>
+      </w:r>
+    </w:p>
+    <w:p>
+      <w:pPr>
+        <w:rPr>
+          <w:b/>
+          <w:bCs/>
+          <w:sz w:val="36"/>
+          <w:szCs w:val="36"/>
+        </w:rPr>
+      </w:pPr>
+      <w:r>
+        <w:rPr>
+          <w:b/>
+          <w:bCs/>
+          <w:sz w:val="36"/>
+          <w:szCs w:val="36"/>
+        </w:rPr>
+        <w:lastRenderedPageBreak/>
+        <w:drawing>
+          <wp:inline distT="0" distB="0" distL="0" distR="0" wp14:anchorId="001A2931" wp14:editId="5AA107E1">
+            <wp:extent cx="5486400" cy="2912110"/>
+            <wp:effectExtent l="0" t="0" r="0" b="2540"/>
+            <wp:docPr id="972117177" name="Picture 1"/>
+            <wp:cNvGraphicFramePr>
+              <a:graphicFrameLocks xmlns:a="http://schemas.openxmlformats.org/drawingml/2006/main" noChangeAspect="1"/>
+            </wp:cNvGraphicFramePr>
+            <a:graphic xmlns:a="http://schemas.openxmlformats.org/drawingml/2006/main">
+              <a:graphicData uri="http://schemas.openxmlformats.org/drawingml/2006/picture">
+                <pic:pic xmlns:pic="http://schemas.openxmlformats.org/drawingml/2006/picture">
+                  <pic:nvPicPr>
+                    <pic:cNvPr id="972117177" name=""/>
+                    <pic:cNvPicPr/>
+                  </pic:nvPicPr>
+                  <pic:blipFill>
+                    <a:blip r:embed="rId13"/>
+                    <a:stretch>
+                      <a:fillRect/>
+                    </a:stretch>
+                  </pic:blipFill>
+                  <pic:spPr>
+                    <a:xfrm>
+                      <a:off x="0" y="0"/>
+                      <a:ext cx="5486400" cy="2912110"/>
+                    </a:xfrm>
+                    <a:prstGeom prst="rect">
+                      <a:avLst/>
+                    </a:prstGeom>
+                  </pic:spPr>
+                </pic:pic>
+              </a:graphicData>
+            </a:graphic>
+          </wp:inline>
+        </w:drawing>
+      </w:r>
+    </w:p>
+    <w:p>
+      <w:pPr>
+        <w:rPr>
+          <w:b/>
+          <w:bCs/>
+          <w:sz w:val="36"/>
+          <w:szCs w:val="36"/>
+        </w:rPr>
+      </w:pPr>
+      <w:r>
+        <w:rPr>
+          <w:b/>
+          <w:bCs/>
+          <w:sz w:val="36"/>
+          <w:szCs w:val="36"/>
+        </w:rPr>
+        <w:drawing>
+          <wp:inline distT="0" distB="0" distL="0" distR="0" wp14:anchorId="1559A0AC" wp14:editId="25471FFA">
+            <wp:extent cx="5486400" cy="4022090"/>
+            <wp:effectExtent l="0" t="0" r="0" b="0"/>
+            <wp:docPr id="1221296763" name="Picture 1"/>
+            <wp:cNvGraphicFramePr>
+              <a:graphicFrameLocks xmlns:a="http://schemas.openxmlformats.org/drawingml/2006/main" noChangeAspect="1"/>
+            </wp:cNvGraphicFramePr>
+            <a:graphic xmlns:a="http://schemas.openxmlformats.org/drawingml/2006/main">
+              <a:graphicData uri="http://schemas.openxmlformats.org/drawingml/2006/picture">
+                <pic:pic xmlns:pic="http://schemas.openxmlformats.org/drawingml/2006/picture">
+                  <pic:nvPicPr>
+                    <pic:cNvPr id="1221296763" name=""/>
+                    <pic:cNvPicPr/>
+                  </pic:nvPicPr>
+                  <pic:blipFill>
+                    <a:blip r:embed="rId14"/>
+                    <a:stretch>
+                      <a:fillRect/>
+                    </a:stretch>
+                  </pic:blipFill>
+                  <pic:spPr>
+                    <a:xfrm>
+                      <a:off x="0" y="0"/>
+                      <a:ext cx="5486400" cy="4022090"/>
+                    </a:xfrm>
+                    <a:prstGeom prst="rect">
+                      <a:avLst/>
+                    </a:prstGeom>
+                  </pic:spPr>
+                </pic:pic>
+              </a:graphicData>
+            </a:graphic>
+          </wp:inline>
+        </w:drawing>
+      </w:r>
+    </w:p>
+    <w:p>
+      <w:pPr>
+        <w:rPr>
+          <w:b/>
+          <w:bCs/>
+          <w:sz w:val="36"/>
+          <w:szCs w:val="36"/>
+        </w:rPr>
+      </w:pPr>
+    </w:p>
+    <w:p>
+      <w:pPr>
+        <w:rPr>
+          <w:b/>
+          <w:bCs/>
+          <w:sz w:val="36"/>
+          <w:szCs w:val="36"/>
+        </w:rPr>
+      </w:pPr>
+    </w:p>
+    <w:p>
+      <w:pPr>
+        <w:rPr>
+          <w:b/>
+          <w:bCs/>
+          <w:sz w:val="36"/>
+          <w:szCs w:val="36"/>
+        </w:rPr>
+      </w:pPr>
+      <w:r>
+        <w:rPr>
+          <w:b/>
+          <w:bCs/>
+          <w:sz w:val="36"/>
+          <w:szCs w:val="36"/>
+        </w:rPr>
+        <w:lastRenderedPageBreak/>
         <w:t>Config.java</w:t>
       </w:r>
     </w:p>
@@ -765,23 +1218,76 @@
           <w:szCs w:val="36"/>
         </w:rPr>
       </w:pPr>
-    </w:p>
-    <w:p>
-      <w:pPr>
+      <w:r>
         <w:rPr>
           <w:b/>
           <w:bCs/>
           <w:sz w:val="36"/>
           <w:szCs w:val="36"/>
         </w:rPr>
-      </w:pPr>
-      <w:r>
+        <w:drawing>
+          <wp:inline distT="0" distB="0" distL="0" distR="0" wp14:anchorId="7C0D4D82" wp14:editId="2007F66D">
+            <wp:extent cx="5486400" cy="1539875"/>
+            <wp:effectExtent l="0" t="0" r="0" b="3175"/>
+            <wp:docPr id="178012581" name="Picture 1"/>
+            <wp:cNvGraphicFramePr>
+              <a:graphicFrameLocks xmlns:a="http://schemas.openxmlformats.org/drawingml/2006/main" noChangeAspect="1"/>
+            </wp:cNvGraphicFramePr>
+            <a:graphic xmlns:a="http://schemas.openxmlformats.org/drawingml/2006/main">
+              <a:graphicData uri="http://schemas.openxmlformats.org/drawingml/2006/picture">
+                <pic:pic xmlns:pic="http://schemas.openxmlformats.org/drawingml/2006/picture">
+                  <pic:nvPicPr>
+                    <pic:cNvPr id="178012581" name=""/>
+                    <pic:cNvPicPr/>
+                  </pic:nvPicPr>
+                  <pic:blipFill>
+                    <a:blip r:embed="rId15"/>
+                    <a:stretch>
+                      <a:fillRect/>
+                    </a:stretch>
+                  </pic:blipFill>
+                  <pic:spPr>
+                    <a:xfrm>
+                      <a:off x="0" y="0"/>
+                      <a:ext cx="5486400" cy="1539875"/>
+                    </a:xfrm>
+                    <a:prstGeom prst="rect">
+                      <a:avLst/>
+                    </a:prstGeom>
+                  </pic:spPr>
+                </pic:pic>
+              </a:graphicData>
+            </a:graphic>
+          </wp:inline>
+        </w:drawing>
+      </w:r>
+    </w:p>
+    <w:p>
+      <w:pPr>
         <w:rPr>
           <w:b/>
           <w:bCs/>
           <w:sz w:val="36"/>
           <w:szCs w:val="36"/>
         </w:rPr>
+      </w:pPr>
+    </w:p>
+    <w:p>
+      <w:pPr>
+        <w:rPr>
+          <w:b/>
+          <w:bCs/>
+          <w:sz w:val="36"/>
+          <w:szCs w:val="36"/>
+        </w:rPr>
+      </w:pPr>
+      <w:r>
+        <w:rPr>
+          <w:b/>
+          <w:bCs/>
+          <w:sz w:val="36"/>
+          <w:szCs w:val="36"/>
+        </w:rPr>
         <w:t>SpecFactory.java</w:t>
       </w:r>
     </w:p>
@@ -794,16 +1300,49 @@
           <w:szCs w:val="36"/>
         </w:rPr>
       </w:pPr>
-    </w:p>
-    <w:p>
-      <w:pPr>
+      <w:r>
         <w:rPr>
           <w:b/>
           <w:bCs/>
           <w:sz w:val="36"/>
           <w:szCs w:val="36"/>
         </w:rPr>
-      </w:pPr>
+        <w:drawing>
+          <wp:inline distT="0" distB="0" distL="0" distR="0" wp14:anchorId="10FA3F4F" wp14:editId="42047B17">
+            <wp:extent cx="5486400" cy="3134995"/>
+            <wp:effectExtent l="0" t="0" r="0" b="8255"/>
+            <wp:docPr id="490091627" name="Picture 1"/>
+            <wp:cNvGraphicFramePr>
+              <a:graphicFrameLocks xmlns:a="http://schemas.openxmlformats.org/drawingml/2006/main" noChangeAspect="1"/>
+            </wp:cNvGraphicFramePr>
+            <a:graphic xmlns:a="http://schemas.openxmlformats.org/drawingml/2006/main">
+              <a:graphicData uri="http://schemas.openxmlformats.org/drawingml/2006/picture">
+                <pic:pic xmlns:pic="http://schemas.openxmlformats.org/drawingml/2006/picture">
+                  <pic:nvPicPr>
+                    <pic:cNvPr id="490091627" name=""/>
+                    <pic:cNvPicPr/>
+                  </pic:nvPicPr>
+                  <pic:blipFill>
+                    <a:blip r:embed="rId16"/>
+                    <a:stretch>
+                      <a:fillRect/>
+                    </a:stretch>
+                  </pic:blipFill>
+                  <pic:spPr>
+                    <a:xfrm>
+                      <a:off x="0" y="0"/>
+                      <a:ext cx="5486400" cy="3134995"/>
+                    </a:xfrm>
+                    <a:prstGeom prst="rect">
+                      <a:avLst/>
+                    </a:prstGeom>
+                  </pic:spPr>
+                </pic:pic>
+              </a:graphicData>
+            </a:graphic>
+          </wp:inline>
+        </w:drawing>
+      </w:r>
     </w:p>
     <w:p>
       <w:pPr>
@@ -814,7 +1353,6 @@
           <w:szCs w:val="36"/>
         </w:rPr>
       </w:pPr>
-      <w:proofErr w:type="spellStart"/>
       <w:r>
         <w:rPr>
           <w:b/>
@@ -822,9 +1360,43 @@
           <w:sz w:val="36"/>
           <w:szCs w:val="36"/>
         </w:rPr>
-        <w:t>apiTest</w:t>
+        <w:lastRenderedPageBreak/>
+        <w:drawing>
+          <wp:inline distT="0" distB="0" distL="0" distR="0" wp14:anchorId="4D3391B8" wp14:editId="5DC7FC11">
+            <wp:extent cx="5486400" cy="3476625"/>
+            <wp:effectExtent l="0" t="0" r="0" b="9525"/>
+            <wp:docPr id="1710688249" name="Picture 1"/>
+            <wp:cNvGraphicFramePr>
+              <a:graphicFrameLocks xmlns:a="http://schemas.openxmlformats.org/drawingml/2006/main" noChangeAspect="1"/>
+            </wp:cNvGraphicFramePr>
+            <a:graphic xmlns:a="http://schemas.openxmlformats.org/drawingml/2006/main">
+              <a:graphicData uri="http://schemas.openxmlformats.org/drawingml/2006/picture">
+                <pic:pic xmlns:pic="http://schemas.openxmlformats.org/drawingml/2006/picture">
+                  <pic:nvPicPr>
+                    <pic:cNvPr id="1710688249" name=""/>
+                    <pic:cNvPicPr/>
+                  </pic:nvPicPr>
+                  <pic:blipFill>
+                    <a:blip r:embed="rId17"/>
+                    <a:stretch>
+                      <a:fillRect/>
+                    </a:stretch>
+                  </pic:blipFill>
+                  <pic:spPr>
+                    <a:xfrm>
+                      <a:off x="0" y="0"/>
+                      <a:ext cx="5486400" cy="3476625"/>
+                    </a:xfrm>
+                    <a:prstGeom prst="rect">
+                      <a:avLst/>
+                    </a:prstGeom>
+                  </pic:spPr>
+                </pic:pic>
+              </a:graphicData>
+            </a:graphic>
+          </wp:inline>
+        </w:drawing>
       </w:r>
-      <w:proofErr w:type="spellEnd"/>
     </w:p>
     <w:p>
       <w:pPr>
@@ -845,18 +1417,16 @@
           <w:szCs w:val="36"/>
         </w:rPr>
       </w:pPr>
-    </w:p>
-    <w:p>
-      <w:pPr>
+      <w:r>
         <w:rPr>
           <w:b/>
           <w:bCs/>
           <w:sz w:val="36"/>
           <w:szCs w:val="36"/>
         </w:rPr>
-      </w:pPr>
+        <w:t>Result</w:t>
+      </w:r>
     </w:p>
-    <w:p/>
     <w:p>
       <w:pPr>
         <w:rPr>
@@ -866,16 +1436,49 @@
           <w:szCs w:val="36"/>
         </w:rPr>
       </w:pPr>
-    </w:p>
-    <w:p>
-      <w:pPr>
+      <w:r>
         <w:rPr>
           <w:b/>
           <w:bCs/>
           <w:sz w:val="36"/>
           <w:szCs w:val="36"/>
         </w:rPr>
-      </w:pPr>
+        <w:drawing>
+          <wp:inline distT="0" distB="0" distL="0" distR="0" wp14:anchorId="4FC0D6A0" wp14:editId="19DC91CF">
+            <wp:extent cx="5486400" cy="2534285"/>
+            <wp:effectExtent l="0" t="0" r="0" b="0"/>
+            <wp:docPr id="22866477" name="Picture 1"/>
+            <wp:cNvGraphicFramePr>
+              <a:graphicFrameLocks xmlns:a="http://schemas.openxmlformats.org/drawingml/2006/main" noChangeAspect="1"/>
+            </wp:cNvGraphicFramePr>
+            <a:graphic xmlns:a="http://schemas.openxmlformats.org/drawingml/2006/main">
+              <a:graphicData uri="http://schemas.openxmlformats.org/drawingml/2006/picture">
+                <pic:pic xmlns:pic="http://schemas.openxmlformats.org/drawingml/2006/picture">
+                  <pic:nvPicPr>
+                    <pic:cNvPr id="22866477" name=""/>
+                    <pic:cNvPicPr/>
+                  </pic:nvPicPr>
+                  <pic:blipFill>
+                    <a:blip r:embed="rId18"/>
+                    <a:stretch>
+                      <a:fillRect/>
+                    </a:stretch>
+                  </pic:blipFill>
+                  <pic:spPr>
+                    <a:xfrm>
+                      <a:off x="0" y="0"/>
+                      <a:ext cx="5486400" cy="2534285"/>
+                    </a:xfrm>
+                    <a:prstGeom prst="rect">
+                      <a:avLst/>
+                    </a:prstGeom>
+                  </pic:spPr>
+                </pic:pic>
+              </a:graphicData>
+            </a:graphic>
+          </wp:inline>
+        </w:drawing>
+      </w:r>
     </w:p>
     <w:p>
       <w:pPr>
@@ -886,16 +1489,50 @@
           <w:szCs w:val="36"/>
         </w:rPr>
       </w:pPr>
-    </w:p>
-    <w:p>
-      <w:pPr>
+      <w:r>
         <w:rPr>
           <w:b/>
           <w:bCs/>
           <w:sz w:val="36"/>
           <w:szCs w:val="36"/>
         </w:rPr>
-      </w:pPr>
+        <w:lastRenderedPageBreak/>
+        <w:drawing>
+          <wp:inline distT="0" distB="0" distL="0" distR="0" wp14:anchorId="22A0834F" wp14:editId="3A864678">
+            <wp:extent cx="5486400" cy="2075180"/>
+            <wp:effectExtent l="0" t="0" r="0" b="1270"/>
+            <wp:docPr id="422439725" name="Picture 1"/>
+            <wp:cNvGraphicFramePr>
+              <a:graphicFrameLocks xmlns:a="http://schemas.openxmlformats.org/drawingml/2006/main" noChangeAspect="1"/>
+            </wp:cNvGraphicFramePr>
+            <a:graphic xmlns:a="http://schemas.openxmlformats.org/drawingml/2006/main">
+              <a:graphicData uri="http://schemas.openxmlformats.org/drawingml/2006/picture">
+                <pic:pic xmlns:pic="http://schemas.openxmlformats.org/drawingml/2006/picture">
+                  <pic:nvPicPr>
+                    <pic:cNvPr id="422439725" name=""/>
+                    <pic:cNvPicPr/>
+                  </pic:nvPicPr>
+                  <pic:blipFill>
+                    <a:blip r:embed="rId19"/>
+                    <a:stretch>
+                      <a:fillRect/>
+                    </a:stretch>
+                  </pic:blipFill>
+                  <pic:spPr>
+                    <a:xfrm>
+                      <a:off x="0" y="0"/>
+                      <a:ext cx="5486400" cy="2075180"/>
+                    </a:xfrm>
+                    <a:prstGeom prst="rect">
+                      <a:avLst/>
+                    </a:prstGeom>
+                  </pic:spPr>
+                </pic:pic>
+              </a:graphicData>
+            </a:graphic>
+          </wp:inline>
+        </w:drawing>
+      </w:r>
     </w:p>
     <w:p>
       <w:pPr>
@@ -913,7 +1550,7 @@
           <w:sz w:val="36"/>
           <w:szCs w:val="36"/>
         </w:rPr>
-        <w:t>Result</w:t>
+        <w:t>Spark Report</w:t>
       </w:r>
     </w:p>
     <w:p>
@@ -925,16 +1562,102 @@
           <w:szCs w:val="36"/>
         </w:rPr>
       </w:pPr>
-    </w:p>
-    <w:p>
-      <w:pPr>
+      <w:r>
         <w:rPr>
           <w:b/>
           <w:bCs/>
           <w:sz w:val="36"/>
           <w:szCs w:val="36"/>
         </w:rPr>
-      </w:pPr>
+        <w:drawing>
+          <wp:inline distT="0" distB="0" distL="0" distR="0" wp14:anchorId="22C214FE" wp14:editId="4111711A">
+            <wp:extent cx="5486400" cy="1398270"/>
+            <wp:effectExtent l="0" t="0" r="0" b="0"/>
+            <wp:docPr id="1548001550" name="Picture 1"/>
+            <wp:cNvGraphicFramePr>
+              <a:graphicFrameLocks xmlns:a="http://schemas.openxmlformats.org/drawingml/2006/main" noChangeAspect="1"/>
+            </wp:cNvGraphicFramePr>
+            <a:graphic xmlns:a="http://schemas.openxmlformats.org/drawingml/2006/main">
+              <a:graphicData uri="http://schemas.openxmlformats.org/drawingml/2006/picture">
+                <pic:pic xmlns:pic="http://schemas.openxmlformats.org/drawingml/2006/picture">
+                  <pic:nvPicPr>
+                    <pic:cNvPr id="1548001550" name=""/>
+                    <pic:cNvPicPr/>
+                  </pic:nvPicPr>
+                  <pic:blipFill>
+                    <a:blip r:embed="rId20"/>
+                    <a:stretch>
+                      <a:fillRect/>
+                    </a:stretch>
+                  </pic:blipFill>
+                  <pic:spPr>
+                    <a:xfrm>
+                      <a:off x="0" y="0"/>
+                      <a:ext cx="5486400" cy="1398270"/>
+                    </a:xfrm>
+                    <a:prstGeom prst="rect">
+                      <a:avLst/>
+                    </a:prstGeom>
+                  </pic:spPr>
+                </pic:pic>
+              </a:graphicData>
+            </a:graphic>
+          </wp:inline>
+        </w:drawing>
+      </w:r>
+    </w:p>
+    <w:p>
+      <w:pPr>
+        <w:rPr>
+          <w:b/>
+          <w:bCs/>
+          <w:sz w:val="36"/>
+          <w:szCs w:val="36"/>
+        </w:rPr>
+      </w:pPr>
+      <w:r>
+        <w:rPr>
+          <w:b/>
+          <w:bCs/>
+          <w:sz w:val="36"/>
+          <w:szCs w:val="36"/>
+        </w:rPr>
+        <w:drawing>
+          <wp:inline distT="0" distB="0" distL="0" distR="0" wp14:anchorId="57122E13" wp14:editId="74ACA23B">
+            <wp:extent cx="5486400" cy="2141220"/>
+            <wp:effectExtent l="0" t="0" r="0" b="0"/>
+            <wp:docPr id="93326206" name="Picture 1"/>
+            <wp:cNvGraphicFramePr>
+              <a:graphicFrameLocks xmlns:a="http://schemas.openxmlformats.org/drawingml/2006/main" noChangeAspect="1"/>
+            </wp:cNvGraphicFramePr>
+            <a:graphic xmlns:a="http://schemas.openxmlformats.org/drawingml/2006/main">
+              <a:graphicData uri="http://schemas.openxmlformats.org/drawingml/2006/picture">
+                <pic:pic xmlns:pic="http://schemas.openxmlformats.org/drawingml/2006/picture">
+                  <pic:nvPicPr>
+                    <pic:cNvPr id="93326206" name=""/>
+                    <pic:cNvPicPr/>
+                  </pic:nvPicPr>
+                  <pic:blipFill>
+                    <a:blip r:embed="rId21"/>
+                    <a:stretch>
+                      <a:fillRect/>
+                    </a:stretch>
+                  </pic:blipFill>
+                  <pic:spPr>
+                    <a:xfrm>
+                      <a:off x="0" y="0"/>
+                      <a:ext cx="5486400" cy="2141220"/>
+                    </a:xfrm>
+                    <a:prstGeom prst="rect">
+                      <a:avLst/>
+                    </a:prstGeom>
+                  </pic:spPr>
+                </pic:pic>
+              </a:graphicData>
+            </a:graphic>
+          </wp:inline>
+        </w:drawing>
+      </w:r>
     </w:p>
     <w:p>
       <w:pPr>
@@ -970,6 +1693,87 @@
     </w:p>
     <w:p>
       <w:pPr>
+        <w:pStyle w:val="ListParagraph"/>
+        <w:numPr>
+          <w:ilvl w:val="0"/>
+          <w:numId w:val="12"/>
+        </w:numPr>
+      </w:pPr>
+      <w:r>
+        <w:rPr>
+          <w:sz w:val="28"/>
+          <w:szCs w:val="28"/>
+        </w:rPr>
+        <w:t>First create user by using username and password</w:t>
+      </w:r>
+    </w:p>
+    <w:p>
+      <w:pPr>
+        <w:pStyle w:val="ListParagraph"/>
+        <w:numPr>
+          <w:ilvl w:val="0"/>
+          <w:numId w:val="12"/>
+        </w:numPr>
+      </w:pPr>
+      <w:r>
+        <w:rPr>
+          <w:sz w:val="28"/>
+          <w:szCs w:val="28"/>
+        </w:rPr>
+        <w:t xml:space="preserve">By using same username and </w:t>
+      </w:r>
+      <w:proofErr w:type="gramStart"/>
+      <w:r>
+        <w:rPr>
+          <w:sz w:val="28"/>
+          <w:szCs w:val="28"/>
+        </w:rPr>
+        <w:t>password</w:t>
+      </w:r>
+      <w:proofErr w:type="gramEnd"/>
+      <w:r>
+        <w:rPr>
+          <w:sz w:val="28"/>
+          <w:szCs w:val="28"/>
+        </w:rPr>
+        <w:t xml:space="preserve"> </w:t>
+      </w:r>
+      <w:proofErr w:type="gramStart"/>
+      <w:r>
+        <w:rPr>
+          <w:sz w:val="28"/>
+          <w:szCs w:val="28"/>
+        </w:rPr>
+        <w:t>generate</w:t>
+      </w:r>
+      <w:proofErr w:type="gramEnd"/>
+      <w:r>
+        <w:rPr>
+          <w:sz w:val="28"/>
+          <w:szCs w:val="28"/>
+        </w:rPr>
+        <w:t xml:space="preserve"> authorization token</w:t>
+      </w:r>
+    </w:p>
+    <w:p>
+      <w:pPr>
+        <w:pStyle w:val="ListParagraph"/>
+        <w:numPr>
+          <w:ilvl w:val="0"/>
+          <w:numId w:val="12"/>
+        </w:numPr>
+      </w:pPr>
+      <w:r>
+        <w:rPr>
+          <w:sz w:val="28"/>
+          <w:szCs w:val="28"/>
+        </w:rPr>
+        <w:lastRenderedPageBreak/>
+        <w:t>By using Authorization token get list of books</w:t>
+      </w:r>
+    </w:p>
+    <w:p>
+      <w:pPr>
         <w:pStyle w:val="Heading1"/>
         <w:rPr>
           <w:color w:val="auto"/>
@@ -1114,7 +1918,6 @@
           <w:szCs w:val="28"/>
           <w:lang w:val="en-IN"/>
         </w:rPr>
-        <w:lastRenderedPageBreak/>
         <w:t xml:space="preserve">API layers are modularized, ensuring </w:t>
       </w:r>
       <w:r>
@@ -1451,6 +2254,120 @@
     </w:lvl>
   </w:abstractNum>
   <w:abstractNum w:abstractNumId="9" w15:restartNumberingAfterBreak="0">
+    <w:nsid w:val="28E1081D"/>
+    <w:multiLevelType w:val="hybridMultilevel"/>
+    <w:tmpl w:val="1506075C"/>
+    <w:lvl w:ilvl="0" w:tplc="40BA82CA">
+      <w:start w:val="3"/>
+      <w:numFmt w:val="bullet"/>
+      <w:lvlText w:val="-"/>
+      <w:lvlJc w:val="left"/>
+      <w:pPr>
+        <w:ind w:left="720" w:hanging="360"/>
+      </w:pPr>
+      <w:rPr>
+        <w:rFonts w:ascii="Cambria" w:eastAsiaTheme="minorEastAsia" w:hAnsi="Cambria" w:cstheme="minorBidi" w:hint="default"/>
+        <w:sz w:val="28"/>
+      </w:rPr>
+    </w:lvl>
+    <w:lvl w:ilvl="1" w:tplc="40090003" w:tentative="1">
+      <w:start w:val="1"/>
+      <w:numFmt w:val="bullet"/>
+      <w:lvlText w:val="o"/>
+      <w:lvlJc w:val="left"/>
+      <w:pPr>
+        <w:ind w:left="1440" w:hanging="360"/>
+      </w:pPr>
+      <w:rPr>
+        <w:rFonts w:ascii="Courier New" w:hAnsi="Courier New" w:cs="Courier New" w:hint="default"/>
+      </w:rPr>
+    </w:lvl>
+    <w:lvl w:ilvl="2" w:tplc="40090005" w:tentative="1">
+      <w:start w:val="1"/>
+      <w:numFmt w:val="bullet"/>
+      <w:lvlText w:val=""/>
+      <w:lvlJc w:val="left"/>
+      <w:pPr>
+        <w:ind w:left="2160" w:hanging="360"/>
+      </w:pPr>
+      <w:rPr>
+        <w:rFonts w:ascii="Wingdings" w:hAnsi="Wingdings" w:hint="default"/>
+      </w:rPr>
+    </w:lvl>
+    <w:lvl w:ilvl="3" w:tplc="40090001" w:tentative="1">
+      <w:start w:val="1"/>
+      <w:numFmt w:val="bullet"/>
+      <w:lvlText w:val=""/>
+      <w:lvlJc w:val="left"/>
+      <w:pPr>
+        <w:ind w:left="2880" w:hanging="360"/>
+      </w:pPr>
+      <w:rPr>
+        <w:rFonts w:ascii="Symbol" w:hAnsi="Symbol" w:hint="default"/>
+      </w:rPr>
+    </w:lvl>
+    <w:lvl w:ilvl="4" w:tplc="40090003" w:tentative="1">
+      <w:start w:val="1"/>
+      <w:numFmt w:val="bullet"/>
+      <w:lvlText w:val="o"/>
+      <w:lvlJc w:val="left"/>
+      <w:pPr>
+        <w:ind w:left="3600" w:hanging="360"/>
+      </w:pPr>
+      <w:rPr>
+        <w:rFonts w:ascii="Courier New" w:hAnsi="Courier New" w:cs="Courier New" w:hint="default"/>
+      </w:rPr>
+    </w:lvl>
+    <w:lvl w:ilvl="5" w:tplc="40090005" w:tentative="1">
+      <w:start w:val="1"/>
+      <w:numFmt w:val="bullet"/>
+      <w:lvlText w:val=""/>
+      <w:lvlJc w:val="left"/>
+      <w:pPr>
+        <w:ind w:left="4320" w:hanging="360"/>
+      </w:pPr>
+      <w:rPr>
+        <w:rFonts w:ascii="Wingdings" w:hAnsi="Wingdings" w:hint="default"/>
+      </w:rPr>
+    </w:lvl>
+    <w:lvl w:ilvl="6" w:tplc="40090001" w:tentative="1">
+      <w:start w:val="1"/>
+      <w:numFmt w:val="bullet"/>
+      <w:lvlText w:val=""/>
+      <w:lvlJc w:val="left"/>
+      <w:pPr>
+        <w:ind w:left="5040" w:hanging="360"/>
+      </w:pPr>
+      <w:rPr>
+        <w:rFonts w:ascii="Symbol" w:hAnsi="Symbol" w:hint="default"/>
+      </w:rPr>
+    </w:lvl>
+    <w:lvl w:ilvl="7" w:tplc="40090003" w:tentative="1">
+      <w:start w:val="1"/>
+      <w:numFmt w:val="bullet"/>
+      <w:lvlText w:val="o"/>
+      <w:lvlJc w:val="left"/>
+      <w:pPr>
+        <w:ind w:left="5760" w:hanging="360"/>
+      </w:pPr>
+      <w:rPr>
+        <w:rFonts w:ascii="Courier New" w:hAnsi="Courier New" w:cs="Courier New" w:hint="default"/>
+      </w:rPr>
+    </w:lvl>
+    <w:lvl w:ilvl="8" w:tplc="40090005" w:tentative="1">
+      <w:start w:val="1"/>
+      <w:numFmt w:val="bullet"/>
+      <w:lvlText w:val=""/>
+      <w:lvlJc w:val="left"/>
+      <w:pPr>
+        <w:ind w:left="6480" w:hanging="360"/>
+      </w:pPr>
+      <w:rPr>
+        <w:rFonts w:ascii="Wingdings" w:hAnsi="Wingdings" w:hint="default"/>
+      </w:rPr>
+    </w:lvl>
+  </w:abstractNum>
+  <w:abstractNum w:abstractNumId="10" w15:restartNumberingAfterBreak="0">
     <w:nsid w:val="35E56039"/>
     <w:multiLevelType w:val="hybridMultilevel"/>
     <w:tmpl w:val="CD54B576"/>
@@ -1539,7 +2456,7 @@
       </w:pPr>
     </w:lvl>
   </w:abstractNum>
-  <w:abstractNum w:abstractNumId="10" w15:restartNumberingAfterBreak="0">
+  <w:abstractNum w:abstractNumId="11" w15:restartNumberingAfterBreak="0">
     <w:nsid w:val="78BF073E"/>
     <w:multiLevelType w:val="hybridMultilevel"/>
     <w:tmpl w:val="0F465BEE"/>
@@ -1680,9 +2597,12 @@
     <w:abstractNumId w:val="0"/>
   </w:num>
   <w:num w:numId="10" w16cid:durableId="1502040315">
+    <w:abstractNumId w:val="11"/>
+  </w:num>
+  <w:num w:numId="11" w16cid:durableId="1104761807">
     <w:abstractNumId w:val="10"/>
   </w:num>
-  <w:num w:numId="11" w16cid:durableId="1104761807">
+  <w:num w:numId="12" w16cid:durableId="1853103449">
     <w:abstractNumId w:val="9"/>
   </w:num>
 </w:numbering>
@@ -13120,6 +14040,18 @@
       <w:szCs w:val="20"/>
     </w:rPr>
   </w:style>
+  <w:style w:type="character" w:styleId="FollowedHyperlink">
+    <w:name w:val="FollowedHyperlink"/>
+    <w:basedOn w:val="DefaultParagraphFont"/>
+    <w:uiPriority w:val="99"/>
+    <w:semiHidden/>
+    <w:unhideWhenUsed/>
+    <w:rsid w:val="0059103B"/>
+    <w:rPr>
+      <w:color w:val="800080" w:themeColor="followedHyperlink"/>
+      <w:u w:val="single"/>
+    </w:rPr>
+  </w:style>
 </w:styles>
 </file>
 

</xml_diff>